<commit_message>
restaura los comentarios y lleva la cobertura de pruebas al 100 %
- restaura los comentarios del código en src, backend y configuraciones
- recupera la suite completa de 85 archivos y agrega ramas.test.jsx,
ramasPaginas.test.jsx y Blogs.vacio.test.jsx (89 archivos, 804
pruebas)
- quita una rama inalcanzable en Armado.jsx y exporta itemOrden en
datos.js
- actualiza README, ERS y cobertura-testing.md con las cifras nuevas
</commit_message>
<xml_diff>
--- a/ERS - Ensambla.me.docx
+++ b/ERS - Ensambla.me.docx
@@ -3853,7 +3853,7 @@
                 <w:szCs w:val="18"/>
                 <w:lang w:val="es-ES" w:eastAsia="es-ES" w:bidi="ar-SA"/>
               </w:rPr>
-              <w:t>Condensación del documento y actualización de las pruebas (RNF-09)</w:t>
+              <w:t>Condensación del documento y pruebas con cobertura del 100 % (RNF-09)</w:t>
             </w:r>
           </w:p>
         </w:tc>
@@ -5064,7 +5064,7 @@
         <w:jc w:val="both"/>
       </w:pPr>
       <w:r>
-        <w:t>docs/cobertura-testing.md (pruebas y cobertura), docs/estructura-frontend.md, docs/componentes-frontend.md y README.md.</w:t>
+        <w:t>cobertura-testing.md (pruebas y cobertura) y README.md.</w:t>
       </w:r>
     </w:p>
     <w:p>
@@ -8883,7 +8883,7 @@
                 <w:b w:val="0"/>
                 <w:sz w:val="17"/>
               </w:rPr>
-              <w:t>Pruebas unitarias con Vitest y Testing Library, junto al archivo que prueban y ejecutables con npm run test:run. La suite son 10 pruebas, una por elemento: siete componentes (Alerta, Campo, ModalConfirmacion, CajaBusqueda, FiltrosCatalogo, TarjetaProducto y Boleta), el hook useFormulario y las páginas Carrito y Checkout. Cubren renderizado, renderizado condicional, props, estado y eventos, y usan vi.fn y un vi.mock de la pasarela de pago. npm run coverage genera el informe v8: 34,83 % de sentencias, 22,38 % de ramas, 36,34 % de funciones y 36,00 % de líneas. El alcance y los resultados están en docs/cobertura-testing.md.</w:t>
+              <w:t>Pruebas unitarias con Vitest y Testing Library, junto al archivo que prueban y ejecutables con npm run test:run. La suite son 804 pruebas en 89 archivos: lógica y utilidades, datos, contextos, hooks, componentes, todas las vistas de la tienda y del panel, y casos límite. Cubren renderizado, renderizado condicional, props, estado y eventos, y usan vi.fn, vi.spyOn y vi.mock (pasarela de pago y lista de blogs). npm run coverage genera el informe v8: 100 % de sentencias, ramas, funciones y líneas de src/. El alcance y los resultados están en cobertura-testing.md.</w:t>
             </w:r>
           </w:p>
         </w:tc>

</xml_diff>